<commit_message>
Documentation and scripts fixing
</commit_message>
<xml_diff>
--- a/docx-readme/README.docx
+++ b/docx-readme/README.docx
@@ -665,7 +665,14 @@
   <w:p>
     <w:pPr>
       <w:pStyle w:val="Header"/>
-      <w:rPr>
+      <w:tabs>
+        <w:tab w:val="left" w:pos="1418"/>
+      </w:tabs>
+      <w:rPr>
+        <w:rFonts w:ascii="Aptos" w:hAnsi="Aptos"/>
+        <w:b/>
+        <w:bCs/>
+        <w:smallCaps/>
         <w:sz w:val="28"/>
         <w:szCs w:val="28"/>
       </w:rPr>

</xml_diff>

<commit_message>
Add multi-user mode, update documentation
</commit_message>
<xml_diff>
--- a/docx-readme/README.docx
+++ b/docx-readme/README.docx
@@ -257,13 +257,13 @@
         <w:t xml:space="preserve"> </w:t>
       </w:r>
       <w:r>
-        <w:t xml:space="preserve">your operating system. Each OS has two versions of the README (PDF and</w:t>
+        <w:t xml:space="preserve">your operating system. Each OS has two versions of the README (Markdown and</w:t>
       </w:r>
       <w:r>
         <w:t xml:space="preserve"> </w:t>
       </w:r>
       <w:r>
-        <w:t xml:space="preserve">Markdown) containing identical instructions:</w:t>
+        <w:t xml:space="preserve">PDF) containing identical instructions:</w:t>
       </w:r>
     </w:p>
     <w:p>

</xml_diff>